<commit_message>
se agrega readme 2
</commit_message>
<xml_diff>
--- a/WPC300_M3_Sabina_Romero.docx
+++ b/WPC300_M3_Sabina_Romero.docx
@@ -349,16 +349,7 @@
           <w:color w:val="19202E"/>
           <w:lang w:val="es-CL"/>
         </w:rPr>
-        <w:t xml:space="preserve"> </w:t>
-      </w:r>
-      <w:r>
-        <w:rPr>
-          <w:b/>
-          <w:bCs/>
-          <w:color w:val="19202E"/>
-          <w:lang w:val="es-CL"/>
-        </w:rPr>
-        <w:t>RESOLUCIÓN DE PROBLEMAS ANÁLISIS PROCESABLE</w:t>
+        <w:t xml:space="preserve"> RESOLUCIÓN DE PROBLEMAS ANÁLISIS PROCESABLE</w:t>
       </w:r>
     </w:p>
     <w:p>
@@ -652,7 +643,11 @@
     <w:sdt>
       <w:sdtPr>
         <w:rPr>
-          <w:lang w:val="es-ES"/>
+          <w:rFonts w:ascii="Arial" w:eastAsia="Arial" w:hAnsi="Arial" w:cs="Arial"/>
+          <w:color w:val="auto"/>
+          <w:sz w:val="22"/>
+          <w:szCs w:val="22"/>
+          <w:lang w:val="es-ES" w:eastAsia="es-ES" w:bidi="es-ES"/>
         </w:rPr>
         <w:id w:val="-1329288031"/>
         <w:docPartObj>
@@ -662,13 +657,8 @@
       </w:sdtPr>
       <w:sdtEndPr>
         <w:rPr>
-          <w:rFonts w:ascii="Arial" w:eastAsia="Arial" w:hAnsi="Arial" w:cs="Arial"/>
           <w:b/>
           <w:bCs/>
-          <w:color w:val="auto"/>
-          <w:sz w:val="22"/>
-          <w:szCs w:val="22"/>
-          <w:lang w:eastAsia="es-ES" w:bidi="es-ES"/>
         </w:rPr>
       </w:sdtEndPr>
       <w:sdtContent>
@@ -2092,7 +2082,21 @@
         <w:rPr>
           <w:lang w:val="es-CL"/>
         </w:rPr>
-        <w:t>La Dirección de Asuntos Estudiantiles de una universidad privada de EE.UU. ha encargado el presente estudio con el objetivo de respaldar con evidencia estadística su plan de apoyo académico y bienestar para los próximos años. Para ello se analizó el archivo Students_Grading_Dataset.csv, que contiene 5.000 registros de estudiantes universitarios con variables demográficas, académicas y de hábitos personales.</w:t>
+        <w:t xml:space="preserve">La Dirección de Asuntos Estudiantiles de una universidad privada de </w:t>
+      </w:r>
+      <w:proofErr w:type="gramStart"/>
+      <w:r>
+        <w:rPr>
+          <w:lang w:val="es-CL"/>
+        </w:rPr>
+        <w:t>EE.UU.</w:t>
+      </w:r>
+      <w:proofErr w:type="gramEnd"/>
+      <w:r>
+        <w:rPr>
+          <w:lang w:val="es-CL"/>
+        </w:rPr>
+        <w:t xml:space="preserve"> ha encargado el presente estudio con el objetivo de respaldar con evidencia estadística su plan de apoyo académico y bienestar para los próximos años. Para ello se analizó el archivo Students_Grading_Dataset.csv, que contiene 5.000 registros de estudiantes universitarios con variables demográficas, académicas y de hábitos personales.</w:t>
       </w:r>
     </w:p>
     <w:p>
@@ -2682,12 +2686,6 @@
         <w:gridCol w:w="1800"/>
       </w:tblGrid>
       <w:tr>
-        <w:tblPrEx>
-          <w:tblCellMar>
-            <w:top w:w="0" w:type="dxa"/>
-            <w:bottom w:w="0" w:type="dxa"/>
-          </w:tblCellMar>
-        </w:tblPrEx>
         <w:tc>
           <w:tcPr>
             <w:tcW w:w="3600" w:type="dxa"/>
@@ -2789,12 +2787,6 @@
         </w:tc>
       </w:tr>
       <w:tr>
-        <w:tblPrEx>
-          <w:tblCellMar>
-            <w:top w:w="0" w:type="dxa"/>
-            <w:bottom w:w="0" w:type="dxa"/>
-          </w:tblCellMar>
-        </w:tblPrEx>
         <w:tc>
           <w:tcPr>
             <w:tcW w:w="3600" w:type="dxa"/>
@@ -2887,12 +2879,6 @@
         </w:tc>
       </w:tr>
       <w:tr>
-        <w:tblPrEx>
-          <w:tblCellMar>
-            <w:top w:w="0" w:type="dxa"/>
-            <w:bottom w:w="0" w:type="dxa"/>
-          </w:tblCellMar>
-        </w:tblPrEx>
         <w:tc>
           <w:tcPr>
             <w:tcW w:w="3600" w:type="dxa"/>
@@ -2985,12 +2971,6 @@
         </w:tc>
       </w:tr>
       <w:tr>
-        <w:tblPrEx>
-          <w:tblCellMar>
-            <w:top w:w="0" w:type="dxa"/>
-            <w:bottom w:w="0" w:type="dxa"/>
-          </w:tblCellMar>
-        </w:tblPrEx>
         <w:tc>
           <w:tcPr>
             <w:tcW w:w="3600" w:type="dxa"/>
@@ -3245,7 +3225,21 @@
         <w:rPr>
           <w:lang w:val="es-CL"/>
         </w:rPr>
-        <w:t>A continuación se presentan los estadísticos descriptivos de las principales variables numéricas calculados sobre los 2.581 registros completos.</w:t>
+        <w:t xml:space="preserve">A </w:t>
+      </w:r>
+      <w:proofErr w:type="gramStart"/>
+      <w:r>
+        <w:rPr>
+          <w:lang w:val="es-CL"/>
+        </w:rPr>
+        <w:t>continuación</w:t>
+      </w:r>
+      <w:proofErr w:type="gramEnd"/>
+      <w:r>
+        <w:rPr>
+          <w:lang w:val="es-CL"/>
+        </w:rPr>
+        <w:t xml:space="preserve"> se presentan los estadísticos descriptivos de las principales variables numéricas calculados sobre los 2.581 registros completos.</w:t>
       </w:r>
     </w:p>
     <w:p>
@@ -3285,12 +3279,6 @@
         <w:gridCol w:w="1152"/>
       </w:tblGrid>
       <w:tr>
-        <w:tblPrEx>
-          <w:tblCellMar>
-            <w:top w:w="0" w:type="dxa"/>
-            <w:bottom w:w="0" w:type="dxa"/>
-          </w:tblCellMar>
-        </w:tblPrEx>
         <w:tc>
           <w:tcPr>
             <w:tcW w:w="2100" w:type="dxa"/>
@@ -3608,12 +3596,6 @@
         </w:tc>
       </w:tr>
       <w:tr>
-        <w:tblPrEx>
-          <w:tblCellMar>
-            <w:top w:w="0" w:type="dxa"/>
-            <w:bottom w:w="0" w:type="dxa"/>
-          </w:tblCellMar>
-        </w:tblPrEx>
         <w:tc>
           <w:tcPr>
             <w:tcW w:w="2100" w:type="dxa"/>
@@ -3892,12 +3874,6 @@
         </w:tc>
       </w:tr>
       <w:tr>
-        <w:tblPrEx>
-          <w:tblCellMar>
-            <w:top w:w="0" w:type="dxa"/>
-            <w:bottom w:w="0" w:type="dxa"/>
-          </w:tblCellMar>
-        </w:tblPrEx>
         <w:tc>
           <w:tcPr>
             <w:tcW w:w="2100" w:type="dxa"/>
@@ -4176,12 +4152,6 @@
         </w:tc>
       </w:tr>
       <w:tr>
-        <w:tblPrEx>
-          <w:tblCellMar>
-            <w:top w:w="0" w:type="dxa"/>
-            <w:bottom w:w="0" w:type="dxa"/>
-          </w:tblCellMar>
-        </w:tblPrEx>
         <w:tc>
           <w:tcPr>
             <w:tcW w:w="2100" w:type="dxa"/>
@@ -4460,12 +4430,6 @@
         </w:tc>
       </w:tr>
       <w:tr>
-        <w:tblPrEx>
-          <w:tblCellMar>
-            <w:top w:w="0" w:type="dxa"/>
-            <w:bottom w:w="0" w:type="dxa"/>
-          </w:tblCellMar>
-        </w:tblPrEx>
         <w:tc>
           <w:tcPr>
             <w:tcW w:w="2100" w:type="dxa"/>
@@ -4744,12 +4708,6 @@
         </w:tc>
       </w:tr>
       <w:tr>
-        <w:tblPrEx>
-          <w:tblCellMar>
-            <w:top w:w="0" w:type="dxa"/>
-            <w:bottom w:w="0" w:type="dxa"/>
-          </w:tblCellMar>
-        </w:tblPrEx>
         <w:tc>
           <w:tcPr>
             <w:tcW w:w="2100" w:type="dxa"/>
@@ -5028,12 +4986,6 @@
         </w:tc>
       </w:tr>
       <w:tr>
-        <w:tblPrEx>
-          <w:tblCellMar>
-            <w:top w:w="0" w:type="dxa"/>
-            <w:bottom w:w="0" w:type="dxa"/>
-          </w:tblCellMar>
-        </w:tblPrEx>
         <w:tc>
           <w:tcPr>
             <w:tcW w:w="2100" w:type="dxa"/>
@@ -5322,12 +5274,6 @@
         </w:tc>
       </w:tr>
       <w:tr>
-        <w:tblPrEx>
-          <w:tblCellMar>
-            <w:top w:w="0" w:type="dxa"/>
-            <w:bottom w:w="0" w:type="dxa"/>
-          </w:tblCellMar>
-        </w:tblPrEx>
         <w:tc>
           <w:tcPr>
             <w:tcW w:w="2100" w:type="dxa"/>
@@ -5606,12 +5552,6 @@
         </w:tc>
       </w:tr>
       <w:tr>
-        <w:tblPrEx>
-          <w:tblCellMar>
-            <w:top w:w="0" w:type="dxa"/>
-            <w:bottom w:w="0" w:type="dxa"/>
-          </w:tblCellMar>
-        </w:tblPrEx>
         <w:tc>
           <w:tcPr>
             <w:tcW w:w="2100" w:type="dxa"/>
@@ -5890,12 +5830,6 @@
         </w:tc>
       </w:tr>
       <w:tr>
-        <w:tblPrEx>
-          <w:tblCellMar>
-            <w:top w:w="0" w:type="dxa"/>
-            <w:bottom w:w="0" w:type="dxa"/>
-          </w:tblCellMar>
-        </w:tblPrEx>
         <w:tc>
           <w:tcPr>
             <w:tcW w:w="2100" w:type="dxa"/>
@@ -6174,12 +6108,6 @@
         </w:tc>
       </w:tr>
       <w:tr>
-        <w:tblPrEx>
-          <w:tblCellMar>
-            <w:top w:w="0" w:type="dxa"/>
-            <w:bottom w:w="0" w:type="dxa"/>
-          </w:tblCellMar>
-        </w:tblPrEx>
         <w:tc>
           <w:tcPr>
             <w:tcW w:w="2100" w:type="dxa"/>
@@ -6476,12 +6404,6 @@
         </w:tc>
       </w:tr>
       <w:tr>
-        <w:tblPrEx>
-          <w:tblCellMar>
-            <w:top w:w="0" w:type="dxa"/>
-            <w:bottom w:w="0" w:type="dxa"/>
-          </w:tblCellMar>
-        </w:tblPrEx>
         <w:tc>
           <w:tcPr>
             <w:tcW w:w="2100" w:type="dxa"/>
@@ -6760,12 +6682,6 @@
         </w:tc>
       </w:tr>
       <w:tr>
-        <w:tblPrEx>
-          <w:tblCellMar>
-            <w:top w:w="0" w:type="dxa"/>
-            <w:bottom w:w="0" w:type="dxa"/>
-          </w:tblCellMar>
-        </w:tblPrEx>
         <w:tc>
           <w:tcPr>
             <w:tcW w:w="2100" w:type="dxa"/>
@@ -7079,35 +6995,21 @@
         <w:rPr>
           <w:lang w:val="es-CL"/>
         </w:rPr>
-        <w:t>•</w:t>
-      </w:r>
-      <w:r>
-        <w:rPr>
-          <w:lang w:val="es-CL"/>
-        </w:rPr>
-        <w:tab/>
-        <w:t>Los puntajes académicos (parcial, final, tareas, proyectos) presentan una distribución prácticamente simétrica (asimetría ≈ 0), con medias cercanas a 70-75 puntos.</w:t>
-      </w:r>
-    </w:p>
-    <w:p>
-      <w:pPr>
-        <w:jc w:val="both"/>
-        <w:rPr>
-          <w:lang w:val="es-CL"/>
-        </w:rPr>
-      </w:pPr>
-      <w:r>
-        <w:rPr>
-          <w:lang w:val="es-CL"/>
-        </w:rPr>
-        <w:t>•</w:t>
-      </w:r>
-      <w:r>
-        <w:rPr>
-          <w:lang w:val="es-CL"/>
-        </w:rPr>
-        <w:tab/>
-        <w:t>Las horas de estudio semanales tienen una media de 17.6 h/</w:t>
+        <w:t>•Los puntajes académicos (parcial, final, tareas, proyectos) presentan una distribución prácticamente simétrica (asimetría ≈ 0), con medias cercanas a 70-75 puntos.</w:t>
+      </w:r>
+    </w:p>
+    <w:p>
+      <w:pPr>
+        <w:jc w:val="both"/>
+        <w:rPr>
+          <w:lang w:val="es-CL"/>
+        </w:rPr>
+      </w:pPr>
+      <w:r>
+        <w:rPr>
+          <w:lang w:val="es-CL"/>
+        </w:rPr>
+        <w:t>•Las horas de estudio semanales tienen una media de 17.6 h/</w:t>
       </w:r>
       <w:proofErr w:type="spellStart"/>
       <w:r>
@@ -7135,35 +7037,21 @@
         <w:rPr>
           <w:lang w:val="es-CL"/>
         </w:rPr>
-        <w:t>•</w:t>
-      </w:r>
-      <w:r>
-        <w:rPr>
-          <w:lang w:val="es-CL"/>
-        </w:rPr>
-        <w:tab/>
-        <w:t>El nivel de estrés tiene una distribución casi uniforme entre 1 y 10, con media 5.45 y mediana 5, sugiriendo ausencia de sesgo.</w:t>
-      </w:r>
-    </w:p>
-    <w:p>
-      <w:pPr>
-        <w:jc w:val="both"/>
-        <w:rPr>
-          <w:lang w:val="es-CL"/>
-        </w:rPr>
-      </w:pPr>
-      <w:r>
-        <w:rPr>
-          <w:lang w:val="es-CL"/>
-        </w:rPr>
-        <w:t>•</w:t>
-      </w:r>
-      <w:r>
-        <w:rPr>
-          <w:lang w:val="es-CL"/>
-        </w:rPr>
-        <w:tab/>
-        <w:t>La asistencia promedia un 75.4% con alta variabilidad (DE = 14.3%), con estudiantes que van desde 50% hasta 100%.</w:t>
+        <w:t>•El nivel de estrés tiene una distribución casi uniforme entre 1 y 10, con media 5.45 y mediana 5, sugiriendo ausencia de sesgo.</w:t>
+      </w:r>
+    </w:p>
+    <w:p>
+      <w:pPr>
+        <w:jc w:val="both"/>
+        <w:rPr>
+          <w:lang w:val="es-CL"/>
+        </w:rPr>
+      </w:pPr>
+      <w:r>
+        <w:rPr>
+          <w:lang w:val="es-CL"/>
+        </w:rPr>
+        <w:t>•La asistencia promedia un 75.4% con alta variabilidad (DE = 14.3%), con estudiantes que van desde 50% hasta 100%.</w:t>
       </w:r>
     </w:p>
     <w:p>
@@ -7334,12 +7222,6 @@
         <w:gridCol w:w="1580"/>
       </w:tblGrid>
       <w:tr>
-        <w:tblPrEx>
-          <w:tblCellMar>
-            <w:top w:w="0" w:type="dxa"/>
-            <w:bottom w:w="0" w:type="dxa"/>
-          </w:tblCellMar>
-        </w:tblPrEx>
         <w:tc>
           <w:tcPr>
             <w:tcW w:w="3200" w:type="dxa"/>
@@ -7506,12 +7388,6 @@
         </w:tc>
       </w:tr>
       <w:tr>
-        <w:tblPrEx>
-          <w:tblCellMar>
-            <w:top w:w="0" w:type="dxa"/>
-            <w:bottom w:w="0" w:type="dxa"/>
-          </w:tblCellMar>
-        </w:tblPrEx>
         <w:tc>
           <w:tcPr>
             <w:tcW w:w="3200" w:type="dxa"/>
@@ -7691,12 +7567,6 @@
         </w:tc>
       </w:tr>
       <w:tr>
-        <w:tblPrEx>
-          <w:tblCellMar>
-            <w:top w:w="0" w:type="dxa"/>
-            <w:bottom w:w="0" w:type="dxa"/>
-          </w:tblCellMar>
-        </w:tblPrEx>
         <w:tc>
           <w:tcPr>
             <w:tcW w:w="3200" w:type="dxa"/>
@@ -7876,12 +7746,6 @@
         </w:tc>
       </w:tr>
       <w:tr>
-        <w:tblPrEx>
-          <w:tblCellMar>
-            <w:top w:w="0" w:type="dxa"/>
-            <w:bottom w:w="0" w:type="dxa"/>
-          </w:tblCellMar>
-        </w:tblPrEx>
         <w:tc>
           <w:tcPr>
             <w:tcW w:w="3200" w:type="dxa"/>
@@ -8061,12 +7925,6 @@
         </w:tc>
       </w:tr>
       <w:tr>
-        <w:tblPrEx>
-          <w:tblCellMar>
-            <w:top w:w="0" w:type="dxa"/>
-            <w:bottom w:w="0" w:type="dxa"/>
-          </w:tblCellMar>
-        </w:tblPrEx>
         <w:tc>
           <w:tcPr>
             <w:tcW w:w="3200" w:type="dxa"/>
@@ -8373,12 +8231,6 @@
         <w:gridCol w:w="3360"/>
       </w:tblGrid>
       <w:tr>
-        <w:tblPrEx>
-          <w:tblCellMar>
-            <w:top w:w="0" w:type="dxa"/>
-            <w:bottom w:w="0" w:type="dxa"/>
-          </w:tblCellMar>
-        </w:tblPrEx>
         <w:tc>
           <w:tcPr>
             <w:tcW w:w="2000" w:type="dxa"/>
@@ -8474,12 +8326,6 @@
         </w:tc>
       </w:tr>
       <w:tr>
-        <w:tblPrEx>
-          <w:tblCellMar>
-            <w:top w:w="0" w:type="dxa"/>
-            <w:bottom w:w="0" w:type="dxa"/>
-          </w:tblCellMar>
-        </w:tblPrEx>
         <w:tc>
           <w:tcPr>
             <w:tcW w:w="2000" w:type="dxa"/>
@@ -8634,12 +8480,6 @@
         </w:tc>
       </w:tr>
       <w:tr>
-        <w:tblPrEx>
-          <w:tblCellMar>
-            <w:top w:w="0" w:type="dxa"/>
-            <w:bottom w:w="0" w:type="dxa"/>
-          </w:tblCellMar>
-        </w:tblPrEx>
         <w:tc>
           <w:tcPr>
             <w:tcW w:w="2000" w:type="dxa"/>
@@ -8777,12 +8617,6 @@
         </w:tc>
       </w:tr>
       <w:tr>
-        <w:tblPrEx>
-          <w:tblCellMar>
-            <w:top w:w="0" w:type="dxa"/>
-            <w:bottom w:w="0" w:type="dxa"/>
-          </w:tblCellMar>
-        </w:tblPrEx>
         <w:tc>
           <w:tcPr>
             <w:tcW w:w="2000" w:type="dxa"/>
@@ -8957,12 +8791,6 @@
         <w:gridCol w:w="1760"/>
       </w:tblGrid>
       <w:tr>
-        <w:tblPrEx>
-          <w:tblCellMar>
-            <w:top w:w="0" w:type="dxa"/>
-            <w:bottom w:w="0" w:type="dxa"/>
-          </w:tblCellMar>
-        </w:tblPrEx>
         <w:tc>
           <w:tcPr>
             <w:tcW w:w="2800" w:type="dxa"/>
@@ -9132,12 +8960,6 @@
         </w:tc>
       </w:tr>
       <w:tr>
-        <w:tblPrEx>
-          <w:tblCellMar>
-            <w:top w:w="0" w:type="dxa"/>
-            <w:bottom w:w="0" w:type="dxa"/>
-          </w:tblCellMar>
-        </w:tblPrEx>
         <w:tc>
           <w:tcPr>
             <w:tcW w:w="2800" w:type="dxa"/>
@@ -9294,12 +9116,6 @@
         </w:tc>
       </w:tr>
       <w:tr>
-        <w:tblPrEx>
-          <w:tblCellMar>
-            <w:top w:w="0" w:type="dxa"/>
-            <w:bottom w:w="0" w:type="dxa"/>
-          </w:tblCellMar>
-        </w:tblPrEx>
         <w:tc>
           <w:tcPr>
             <w:tcW w:w="2800" w:type="dxa"/>
@@ -9456,12 +9272,6 @@
         </w:tc>
       </w:tr>
       <w:tr>
-        <w:tblPrEx>
-          <w:tblCellMar>
-            <w:top w:w="0" w:type="dxa"/>
-            <w:bottom w:w="0" w:type="dxa"/>
-          </w:tblCellMar>
-        </w:tblPrEx>
         <w:tc>
           <w:tcPr>
             <w:tcW w:w="2800" w:type="dxa"/>
@@ -9736,12 +9546,6 @@
         <w:gridCol w:w="1760"/>
       </w:tblGrid>
       <w:tr>
-        <w:tblPrEx>
-          <w:tblCellMar>
-            <w:top w:w="0" w:type="dxa"/>
-            <w:bottom w:w="0" w:type="dxa"/>
-          </w:tblCellMar>
-        </w:tblPrEx>
         <w:tc>
           <w:tcPr>
             <w:tcW w:w="2800" w:type="dxa"/>
@@ -9911,12 +9715,6 @@
         </w:tc>
       </w:tr>
       <w:tr>
-        <w:tblPrEx>
-          <w:tblCellMar>
-            <w:top w:w="0" w:type="dxa"/>
-            <w:bottom w:w="0" w:type="dxa"/>
-          </w:tblCellMar>
-        </w:tblPrEx>
         <w:tc>
           <w:tcPr>
             <w:tcW w:w="2800" w:type="dxa"/>
@@ -10073,12 +9871,6 @@
         </w:tc>
       </w:tr>
       <w:tr>
-        <w:tblPrEx>
-          <w:tblCellMar>
-            <w:top w:w="0" w:type="dxa"/>
-            <w:bottom w:w="0" w:type="dxa"/>
-          </w:tblCellMar>
-        </w:tblPrEx>
         <w:tc>
           <w:tcPr>
             <w:tcW w:w="2800" w:type="dxa"/>
@@ -10235,12 +10027,6 @@
         </w:tc>
       </w:tr>
       <w:tr>
-        <w:tblPrEx>
-          <w:tblCellMar>
-            <w:top w:w="0" w:type="dxa"/>
-            <w:bottom w:w="0" w:type="dxa"/>
-          </w:tblCellMar>
-        </w:tblPrEx>
         <w:tc>
           <w:tcPr>
             <w:tcW w:w="2800" w:type="dxa"/>
@@ -10516,12 +10302,6 @@
         <w:gridCol w:w="1800"/>
       </w:tblGrid>
       <w:tr>
-        <w:tblPrEx>
-          <w:tblCellMar>
-            <w:top w:w="0" w:type="dxa"/>
-            <w:bottom w:w="0" w:type="dxa"/>
-          </w:tblCellMar>
-        </w:tblPrEx>
         <w:tc>
           <w:tcPr>
             <w:tcW w:w="1800" w:type="dxa"/>
@@ -10638,12 +10418,6 @@
         </w:tc>
       </w:tr>
       <w:tr>
-        <w:tblPrEx>
-          <w:tblCellMar>
-            <w:top w:w="0" w:type="dxa"/>
-            <w:bottom w:w="0" w:type="dxa"/>
-          </w:tblCellMar>
-        </w:tblPrEx>
         <w:tc>
           <w:tcPr>
             <w:tcW w:w="1800" w:type="dxa"/>
@@ -10736,12 +10510,6 @@
         </w:tc>
       </w:tr>
       <w:tr>
-        <w:tblPrEx>
-          <w:tblCellMar>
-            <w:top w:w="0" w:type="dxa"/>
-            <w:bottom w:w="0" w:type="dxa"/>
-          </w:tblCellMar>
-        </w:tblPrEx>
         <w:tc>
           <w:tcPr>
             <w:tcW w:w="1800" w:type="dxa"/>
@@ -10834,12 +10602,6 @@
         </w:tc>
       </w:tr>
       <w:tr>
-        <w:tblPrEx>
-          <w:tblCellMar>
-            <w:top w:w="0" w:type="dxa"/>
-            <w:bottom w:w="0" w:type="dxa"/>
-          </w:tblCellMar>
-        </w:tblPrEx>
         <w:tc>
           <w:tcPr>
             <w:tcW w:w="1800" w:type="dxa"/>
@@ -10932,12 +10694,6 @@
         </w:tc>
       </w:tr>
       <w:tr>
-        <w:tblPrEx>
-          <w:tblCellMar>
-            <w:top w:w="0" w:type="dxa"/>
-            <w:bottom w:w="0" w:type="dxa"/>
-          </w:tblCellMar>
-        </w:tblPrEx>
         <w:tc>
           <w:tcPr>
             <w:tcW w:w="1800" w:type="dxa"/>
@@ -11034,12 +10790,6 @@
         </w:tc>
       </w:tr>
       <w:tr>
-        <w:tblPrEx>
-          <w:tblCellMar>
-            <w:top w:w="0" w:type="dxa"/>
-            <w:bottom w:w="0" w:type="dxa"/>
-          </w:tblCellMar>
-        </w:tblPrEx>
         <w:tc>
           <w:tcPr>
             <w:tcW w:w="1800" w:type="dxa"/>
@@ -11179,7 +10929,21 @@
         <w:rPr>
           <w:lang w:val="es-CL"/>
         </w:rPr>
-        <w:t xml:space="preserve"> es de apenas 0.06, cuando en datos académicos reales se esperarían correlaciones de 0.30 a 0.70 entre variables como puntaje parcial, puntaje final y nota final.</w:t>
+        <w:t xml:space="preserve"> es de apenas 0.06, cuando en datos académicos reales se esperarían correlaciones de 0.30 a 0.70 entre variables como puntaje parcial, </w:t>
+      </w:r>
+      <w:proofErr w:type="gramStart"/>
+      <w:r>
+        <w:rPr>
+          <w:lang w:val="es-CL"/>
+        </w:rPr>
+        <w:t>puntaje final y nota final</w:t>
+      </w:r>
+      <w:proofErr w:type="gramEnd"/>
+      <w:r>
+        <w:rPr>
+          <w:lang w:val="es-CL"/>
+        </w:rPr>
+        <w:t>.</w:t>
       </w:r>
     </w:p>
     <w:p>
@@ -11889,12 +11653,6 @@
         <w:gridCol w:w="2160"/>
       </w:tblGrid>
       <w:tr>
-        <w:tblPrEx>
-          <w:tblCellMar>
-            <w:top w:w="0" w:type="dxa"/>
-            <w:bottom w:w="0" w:type="dxa"/>
-          </w:tblCellMar>
-        </w:tblPrEx>
         <w:tc>
           <w:tcPr>
             <w:tcW w:w="2500" w:type="dxa"/>
@@ -12064,12 +11822,6 @@
         </w:tc>
       </w:tr>
       <w:tr>
-        <w:tblPrEx>
-          <w:tblCellMar>
-            <w:top w:w="0" w:type="dxa"/>
-            <w:bottom w:w="0" w:type="dxa"/>
-          </w:tblCellMar>
-        </w:tblPrEx>
         <w:tc>
           <w:tcPr>
             <w:tcW w:w="2500" w:type="dxa"/>
@@ -12263,12 +12015,6 @@
         </w:tc>
       </w:tr>
       <w:tr>
-        <w:tblPrEx>
-          <w:tblCellMar>
-            <w:top w:w="0" w:type="dxa"/>
-            <w:bottom w:w="0" w:type="dxa"/>
-          </w:tblCellMar>
-        </w:tblPrEx>
         <w:tc>
           <w:tcPr>
             <w:tcW w:w="2500" w:type="dxa"/>
@@ -14406,15 +14152,6 @@
 </file>
 
 <file path=customXml/item1.xml><?xml version="1.0" encoding="utf-8"?>
-<?mso-contentType ?>
-<FormTemplates xmlns="http://schemas.microsoft.com/sharepoint/v3/contenttype/forms">
-  <Display>DocumentLibraryForm</Display>
-  <Edit>DocumentLibraryForm</Edit>
-  <New>DocumentLibraryForm</New>
-</FormTemplates>
-</file>
-
-<file path=customXml/item2.xml><?xml version="1.0" encoding="utf-8"?>
 <ct:contentTypeSchema xmlns:ct="http://schemas.microsoft.com/office/2006/metadata/contentType" xmlns:ma="http://schemas.microsoft.com/office/2006/metadata/properties/metaAttributes" ct:_="" ma:_="" ma:contentTypeName="Documento" ma:contentTypeID="0x0101006A3CF0994A1E714A9B42E4DFD59DB391" ma:contentTypeVersion="15" ma:contentTypeDescription="Crear nuevo documento." ma:contentTypeScope="" ma:versionID="82d2ccb1fa49349d8b26f1c929f2ed92">
   <xsd:schema xmlns:xsd="http://www.w3.org/2001/XMLSchema" xmlns:xs="http://www.w3.org/2001/XMLSchema" xmlns:p="http://schemas.microsoft.com/office/2006/metadata/properties" xmlns:ns2="bf08cbe6-d8c2-4df8-8ad2-95fed78d5ec1" xmlns:ns3="c23d9321-4fba-4cbf-94dd-2e2b054975a2" targetNamespace="http://schemas.microsoft.com/office/2006/metadata/properties" ma:root="true" ma:fieldsID="f72f0d29f2047968890e95df82e2c3c2" ns2:_="" ns3:_="">
     <xsd:import namespace="bf08cbe6-d8c2-4df8-8ad2-95fed78d5ec1"/>
@@ -14651,7 +14388,20 @@
 </ct:contentTypeSchema>
 </file>
 
+<file path=customXml/item2.xml><?xml version="1.0" encoding="utf-8"?>
+<?mso-contentType ?>
+<FormTemplates xmlns="http://schemas.microsoft.com/sharepoint/v3/contenttype/forms">
+  <Display>DocumentLibraryForm</Display>
+  <Edit>DocumentLibraryForm</Edit>
+  <New>DocumentLibraryForm</New>
+</FormTemplates>
+</file>
+
 <file path=customXml/item3.xml><?xml version="1.0" encoding="utf-8"?>
+<b:Sources xmlns:b="http://schemas.openxmlformats.org/officeDocument/2006/bibliography" xmlns="http://schemas.openxmlformats.org/officeDocument/2006/bibliography" SelectedStyle="\APASixthEditionOfficeOnline.xsl" StyleName="APA" Version="6"/>
+</file>
+
+<file path=customXml/item4.xml><?xml version="1.0" encoding="utf-8"?>
 <p:properties xmlns:p="http://schemas.microsoft.com/office/2006/metadata/properties" xmlns:xsi="http://www.w3.org/2001/XMLSchema-instance" xmlns:pc="http://schemas.microsoft.com/office/infopath/2007/PartnerControls">
   <documentManagement>
     <lcf76f155ced4ddcb4097134ff3c332f xmlns="bf08cbe6-d8c2-4df8-8ad2-95fed78d5ec1">
@@ -14662,19 +14412,7 @@
 </p:properties>
 </file>
 
-<file path=customXml/item4.xml><?xml version="1.0" encoding="utf-8"?>
-<b:Sources xmlns:b="http://schemas.openxmlformats.org/officeDocument/2006/bibliography" xmlns="http://schemas.openxmlformats.org/officeDocument/2006/bibliography" SelectedStyle="\APASixthEditionOfficeOnline.xsl" StyleName="APA" Version="6"/>
-</file>
-
 <file path=customXml/itemProps1.xml><?xml version="1.0" encoding="utf-8"?>
-<ds:datastoreItem xmlns:ds="http://schemas.openxmlformats.org/officeDocument/2006/customXml" ds:itemID="{8A4BEE48-04F2-4AEA-9767-1CF726FC3AFE}">
-  <ds:schemaRefs>
-    <ds:schemaRef ds:uri="http://schemas.microsoft.com/sharepoint/v3/contenttype/forms"/>
-  </ds:schemaRefs>
-</ds:datastoreItem>
-</file>
-
-<file path=customXml/itemProps2.xml><?xml version="1.0" encoding="utf-8"?>
 <ds:datastoreItem xmlns:ds="http://schemas.openxmlformats.org/officeDocument/2006/customXml" ds:itemID="{06A6312D-4C9A-4949-BA06-94AD3C76DFFF}">
   <ds:schemaRefs>
     <ds:schemaRef ds:uri="http://schemas.microsoft.com/office/2006/metadata/contentType"/>
@@ -14693,7 +14431,23 @@
 </ds:datastoreItem>
 </file>
 
+<file path=customXml/itemProps2.xml><?xml version="1.0" encoding="utf-8"?>
+<ds:datastoreItem xmlns:ds="http://schemas.openxmlformats.org/officeDocument/2006/customXml" ds:itemID="{8A4BEE48-04F2-4AEA-9767-1CF726FC3AFE}">
+  <ds:schemaRefs>
+    <ds:schemaRef ds:uri="http://schemas.microsoft.com/sharepoint/v3/contenttype/forms"/>
+  </ds:schemaRefs>
+</ds:datastoreItem>
+</file>
+
 <file path=customXml/itemProps3.xml><?xml version="1.0" encoding="utf-8"?>
+<ds:datastoreItem xmlns:ds="http://schemas.openxmlformats.org/officeDocument/2006/customXml" ds:itemID="{5FF2038D-6147-4945-91C1-E883E825A2E1}">
+  <ds:schemaRefs>
+    <ds:schemaRef ds:uri="http://schemas.openxmlformats.org/officeDocument/2006/bibliography"/>
+  </ds:schemaRefs>
+</ds:datastoreItem>
+</file>
+
+<file path=customXml/itemProps4.xml><?xml version="1.0" encoding="utf-8"?>
 <ds:datastoreItem xmlns:ds="http://schemas.openxmlformats.org/officeDocument/2006/customXml" ds:itemID="{B8842B3A-5446-49B9-A860-BF3918E4344B}">
   <ds:schemaRefs>
     <ds:schemaRef ds:uri="http://schemas.microsoft.com/office/2006/metadata/properties"/>
@@ -14702,12 +14456,4 @@
     <ds:schemaRef ds:uri="c23d9321-4fba-4cbf-94dd-2e2b054975a2"/>
   </ds:schemaRefs>
 </ds:datastoreItem>
-</file>
-
-<file path=customXml/itemProps4.xml><?xml version="1.0" encoding="utf-8"?>
-<ds:datastoreItem xmlns:ds="http://schemas.openxmlformats.org/officeDocument/2006/customXml" ds:itemID="{5FF2038D-6147-4945-91C1-E883E825A2E1}">
-  <ds:schemaRefs>
-    <ds:schemaRef ds:uri="http://schemas.openxmlformats.org/officeDocument/2006/bibliography"/>
-  </ds:schemaRefs>
-</ds:datastoreItem>
 </file>
</xml_diff>